<commit_message>
fix: Meilisearch zoeksortering en footer build-timestamp
- search.py: configure_index() roept client buiten try aan en updatet
  primaryKey bij bestaande index
- use-pakketten.ts: vertaal DRF ordering-params naar Meilisearch sort
  (bijv. -naam → naam:desc, -aantal_gebruikers → populair)
- next.config.js + Footer.tsx: voeg build-timestamp toe in nl-NL formaat
  naast de git commit hash in de footer
- Demonstratiescript bijgewerkt

Co-Authored-By: Claude Opus 4.6 <noreply@anthropic.com>
</commit_message>
<xml_diff>
--- a/docs/Demonstratiescript_Softwarecatalogus.docx
+++ b/docs/Demonstratiescript_Softwarecatalogus.docx
@@ -159,6 +159,7 @@
         <w:alias w:val="Inhoudsopgave"/>
         <w:id w:val="-2080889370"/>
       </w:sdtPr>
+      <w:sdtEndPr/>
       <w:sdtContent>
         <w:p>
           <w:pPr>
@@ -2427,7 +2428,15 @@
                 <w:sz w:val="20"/>
                 <w:szCs w:val="20"/>
               </w:rPr>
-              <w:t>💻  Basis-URL: http://localhost</w:t>
+              <w:t>💻</w:t>
+            </w:r>
+            <w:r>
+              <w:rPr>
+                <w:color w:val="1A3A5C"/>
+                <w:sz w:val="20"/>
+                <w:szCs w:val="20"/>
+              </w:rPr>
+              <w:t xml:space="preserve">  Basis-URL: http://localhost</w:t>
             </w:r>
           </w:p>
           <w:p>
@@ -2440,7 +2449,15 @@
                 <w:sz w:val="20"/>
                 <w:szCs w:val="20"/>
               </w:rPr>
-              <w:t>🔧  Backend API: http://localhost/api/v1/</w:t>
+              <w:t>🔧</w:t>
+            </w:r>
+            <w:r>
+              <w:rPr>
+                <w:color w:val="1A3A5C"/>
+                <w:sz w:val="20"/>
+                <w:szCs w:val="20"/>
+              </w:rPr>
+              <w:t xml:space="preserve">  Backend API: http://localhost/api/v1/</w:t>
             </w:r>
           </w:p>
           <w:p>
@@ -2453,7 +2470,15 @@
                 <w:sz w:val="20"/>
                 <w:szCs w:val="20"/>
               </w:rPr>
-              <w:t>📅  Versie: 1.0 (MVP)</w:t>
+              <w:t>📅</w:t>
+            </w:r>
+            <w:r>
+              <w:rPr>
+                <w:color w:val="1A3A5C"/>
+                <w:sz w:val="20"/>
+                <w:szCs w:val="20"/>
+              </w:rPr>
+              <w:t xml:space="preserve">  Versie: 1.0 (MVP)</w:t>
             </w:r>
           </w:p>
           <w:p>
@@ -2466,7 +2491,23 @@
                 <w:sz w:val="20"/>
                 <w:szCs w:val="20"/>
               </w:rPr>
-              <w:t>⚠️  Let op: dit is een lokale ontwikkelomgeving met voorbeelddata</w:t>
+              <w:t>⚠</w:t>
+            </w:r>
+            <w:r>
+              <w:rPr>
+                <w:color w:val="1A3A5C"/>
+                <w:sz w:val="20"/>
+                <w:szCs w:val="20"/>
+              </w:rPr>
+              <w:t>️</w:t>
+            </w:r>
+            <w:r>
+              <w:rPr>
+                <w:color w:val="1A3A5C"/>
+                <w:sz w:val="20"/>
+                <w:szCs w:val="20"/>
+              </w:rPr>
+              <w:t xml:space="preserve">  Let op: dit is een lokale ontwikkelomgeving met voorbeelddata</w:t>
             </w:r>
           </w:p>
         </w:tc>
@@ -3434,7 +3475,15 @@
                 <w:sz w:val="20"/>
                 <w:szCs w:val="20"/>
               </w:rPr>
-              <w:t>🔗  Navigeer naar: http://localhost</w:t>
+              <w:t>🔗</w:t>
+            </w:r>
+            <w:r>
+              <w:rPr>
+                <w:color w:val="1A3A5C"/>
+                <w:sz w:val="20"/>
+                <w:szCs w:val="20"/>
+              </w:rPr>
+              <w:t xml:space="preserve">  Navigeer naar: http://localhost</w:t>
             </w:r>
           </w:p>
         </w:tc>
@@ -3628,7 +3677,15 @@
                 <w:sz w:val="20"/>
                 <w:szCs w:val="20"/>
               </w:rPr>
-              <w:t>🔗  Navigeer naar: http://localhost/pakketten</w:t>
+              <w:t>🔗</w:t>
+            </w:r>
+            <w:r>
+              <w:rPr>
+                <w:color w:val="1A3A5C"/>
+                <w:sz w:val="20"/>
+                <w:szCs w:val="20"/>
+              </w:rPr>
+              <w:t xml:space="preserve">  Navigeer naar: http://localhost/pakketten</w:t>
             </w:r>
           </w:p>
         </w:tc>
@@ -3913,7 +3970,15 @@
                 <w:sz w:val="20"/>
                 <w:szCs w:val="20"/>
               </w:rPr>
-              <w:t>🔗  Klik op een pakket, bijv. “Suite4Gemeenten”</w:t>
+              <w:t>🔗</w:t>
+            </w:r>
+            <w:r>
+              <w:rPr>
+                <w:color w:val="1A3A5C"/>
+                <w:sz w:val="20"/>
+                <w:szCs w:val="20"/>
+              </w:rPr>
+              <w:t xml:space="preserve">  Klik op een pakket, bijv. “Suite4Gemeenten”</w:t>
             </w:r>
           </w:p>
         </w:tc>
@@ -4228,7 +4293,15 @@
                 <w:sz w:val="20"/>
                 <w:szCs w:val="20"/>
               </w:rPr>
-              <w:t>🔗  Navigeer naar: http://localhost/organisaties</w:t>
+              <w:t>🔗</w:t>
+            </w:r>
+            <w:r>
+              <w:rPr>
+                <w:color w:val="1A3A5C"/>
+                <w:sz w:val="20"/>
+                <w:szCs w:val="20"/>
+              </w:rPr>
+              <w:t xml:space="preserve">  Navigeer naar: http://localhost/organisaties</w:t>
             </w:r>
           </w:p>
         </w:tc>
@@ -4462,7 +4535,15 @@
                 <w:sz w:val="20"/>
                 <w:szCs w:val="20"/>
               </w:rPr>
-              <w:t>🔗  Navigeer naar: http://localhost/standaarden</w:t>
+              <w:t>🔗</w:t>
+            </w:r>
+            <w:r>
+              <w:rPr>
+                <w:color w:val="1A3A5C"/>
+                <w:sz w:val="20"/>
+                <w:szCs w:val="20"/>
+              </w:rPr>
+              <w:t xml:space="preserve">  Navigeer naar: http://localhost/standaarden</w:t>
             </w:r>
           </w:p>
         </w:tc>
@@ -4673,7 +4754,15 @@
                 <w:sz w:val="20"/>
                 <w:szCs w:val="20"/>
               </w:rPr>
-              <w:t>👤  Account: j.jansen@utrecht.nl  |  Wachtwoord: Welkom01!</w:t>
+              <w:t>👤</w:t>
+            </w:r>
+            <w:r>
+              <w:rPr>
+                <w:color w:val="1A3A5C"/>
+                <w:sz w:val="20"/>
+                <w:szCs w:val="20"/>
+              </w:rPr>
+              <w:t xml:space="preserve">  Account: j.jansen@utrecht.nl  |  Wachtwoord: Welkom01!</w:t>
             </w:r>
           </w:p>
           <w:p>
@@ -4686,7 +4775,23 @@
                 <w:sz w:val="20"/>
                 <w:szCs w:val="20"/>
               </w:rPr>
-              <w:t>🏛️  Organisatie: Gemeente Utrecht</w:t>
+              <w:t>🏛</w:t>
+            </w:r>
+            <w:r>
+              <w:rPr>
+                <w:color w:val="1A3A5C"/>
+                <w:sz w:val="20"/>
+                <w:szCs w:val="20"/>
+              </w:rPr>
+              <w:t>️</w:t>
+            </w:r>
+            <w:r>
+              <w:rPr>
+                <w:color w:val="1A3A5C"/>
+                <w:sz w:val="20"/>
+                <w:szCs w:val="20"/>
+              </w:rPr>
+              <w:t xml:space="preserve">  Organisatie: Gemeente Utrecht</w:t>
             </w:r>
           </w:p>
           <w:p>
@@ -4699,7 +4804,15 @@
                 <w:sz w:val="20"/>
                 <w:szCs w:val="20"/>
               </w:rPr>
-              <w:t>🔑  Rol: Gebruik-beheerder</w:t>
+              <w:t>🔑</w:t>
+            </w:r>
+            <w:r>
+              <w:rPr>
+                <w:color w:val="1A3A5C"/>
+                <w:sz w:val="20"/>
+                <w:szCs w:val="20"/>
+              </w:rPr>
+              <w:t xml:space="preserve">  Rol: Gebruik-beheerder</w:t>
             </w:r>
           </w:p>
         </w:tc>
@@ -4768,7 +4881,15 @@
                 <w:sz w:val="20"/>
                 <w:szCs w:val="20"/>
               </w:rPr>
-              <w:t>🔗  Navigeer naar: http://localhost/login</w:t>
+              <w:t>🔗</w:t>
+            </w:r>
+            <w:r>
+              <w:rPr>
+                <w:color w:val="1A3A5C"/>
+                <w:sz w:val="20"/>
+                <w:szCs w:val="20"/>
+              </w:rPr>
+              <w:t xml:space="preserve">  Navigeer naar: http://localhost/login</w:t>
             </w:r>
           </w:p>
         </w:tc>
@@ -5002,7 +5123,15 @@
                 <w:sz w:val="20"/>
                 <w:szCs w:val="20"/>
               </w:rPr>
-              <w:t>🔗  Navigeer naar: http://localhost/mijn-landschap</w:t>
+              <w:t>🔗</w:t>
+            </w:r>
+            <w:r>
+              <w:rPr>
+                <w:color w:val="1A3A5C"/>
+                <w:sz w:val="20"/>
+                <w:szCs w:val="20"/>
+              </w:rPr>
+              <w:t xml:space="preserve">  Navigeer naar: http://localhost/mijn-landschap</w:t>
             </w:r>
           </w:p>
         </w:tc>
@@ -5196,7 +5325,15 @@
                 <w:sz w:val="20"/>
                 <w:szCs w:val="20"/>
               </w:rPr>
-              <w:t>🔗  Klik op “Mijn profiel” in de zijbalk</w:t>
+              <w:t>🔗</w:t>
+            </w:r>
+            <w:r>
+              <w:rPr>
+                <w:color w:val="1A3A5C"/>
+                <w:sz w:val="20"/>
+                <w:szCs w:val="20"/>
+              </w:rPr>
+              <w:t xml:space="preserve">  Klik op “Mijn profiel” in de zijbalk</w:t>
             </w:r>
           </w:p>
         </w:tc>
@@ -5463,7 +5600,15 @@
                 <w:sz w:val="20"/>
                 <w:szCs w:val="20"/>
               </w:rPr>
-              <w:t>👤  Account: verkoop@centric.eu  |  Wachtwoord: Welkom01!</w:t>
+              <w:t>👤</w:t>
+            </w:r>
+            <w:r>
+              <w:rPr>
+                <w:color w:val="1A3A5C"/>
+                <w:sz w:val="20"/>
+                <w:szCs w:val="20"/>
+              </w:rPr>
+              <w:t xml:space="preserve">  Account: verkoop@centric.eu  |  Wachtwoord: Welkom01!</w:t>
             </w:r>
           </w:p>
           <w:p>
@@ -5476,7 +5621,15 @@
                 <w:sz w:val="20"/>
                 <w:szCs w:val="20"/>
               </w:rPr>
-              <w:t>🏢  Organisatie: Centric</w:t>
+              <w:t>🏢</w:t>
+            </w:r>
+            <w:r>
+              <w:rPr>
+                <w:color w:val="1A3A5C"/>
+                <w:sz w:val="20"/>
+                <w:szCs w:val="20"/>
+              </w:rPr>
+              <w:t xml:space="preserve">  Organisatie: Centric</w:t>
             </w:r>
           </w:p>
           <w:p>
@@ -5489,7 +5642,15 @@
                 <w:sz w:val="20"/>
                 <w:szCs w:val="20"/>
               </w:rPr>
-              <w:t>🔑  Rol: Aanbod-beheerder</w:t>
+              <w:t>🔑</w:t>
+            </w:r>
+            <w:r>
+              <w:rPr>
+                <w:color w:val="1A3A5C"/>
+                <w:sz w:val="20"/>
+                <w:szCs w:val="20"/>
+              </w:rPr>
+              <w:t xml:space="preserve">  Rol: Aanbod-beheerder</w:t>
             </w:r>
           </w:p>
         </w:tc>
@@ -5653,7 +5814,15 @@
                 <w:sz w:val="20"/>
                 <w:szCs w:val="20"/>
               </w:rPr>
-              <w:t>🔗  Navigeer naar: http://localhost/aanbod</w:t>
+              <w:t>🔗</w:t>
+            </w:r>
+            <w:r>
+              <w:rPr>
+                <w:color w:val="1A3A5C"/>
+                <w:sz w:val="20"/>
+                <w:szCs w:val="20"/>
+              </w:rPr>
+              <w:t xml:space="preserve">  Navigeer naar: http://localhost/aanbod</w:t>
             </w:r>
           </w:p>
         </w:tc>
@@ -5938,7 +6107,15 @@
                 <w:sz w:val="20"/>
                 <w:szCs w:val="20"/>
               </w:rPr>
-              <w:t>👤  Account: admin@vngrealisatie.nl  |  Wachtwoord: Welkom01!</w:t>
+              <w:t>👤</w:t>
+            </w:r>
+            <w:r>
+              <w:rPr>
+                <w:color w:val="1A3A5C"/>
+                <w:sz w:val="20"/>
+                <w:szCs w:val="20"/>
+              </w:rPr>
+              <w:t xml:space="preserve">  Account: admin@vngrealisatie.nl  |  Wachtwoord: Welkom01!</w:t>
             </w:r>
           </w:p>
           <w:p>
@@ -5951,7 +6128,23 @@
                 <w:sz w:val="20"/>
                 <w:szCs w:val="20"/>
               </w:rPr>
-              <w:t>🏛️  Organisatie: VNG Realisatie BV</w:t>
+              <w:t>🏛</w:t>
+            </w:r>
+            <w:r>
+              <w:rPr>
+                <w:color w:val="1A3A5C"/>
+                <w:sz w:val="20"/>
+                <w:szCs w:val="20"/>
+              </w:rPr>
+              <w:t>️</w:t>
+            </w:r>
+            <w:r>
+              <w:rPr>
+                <w:color w:val="1A3A5C"/>
+                <w:sz w:val="20"/>
+                <w:szCs w:val="20"/>
+              </w:rPr>
+              <w:t xml:space="preserve">  Organisatie: VNG Realisatie BV</w:t>
             </w:r>
           </w:p>
           <w:p>
@@ -5964,7 +6157,15 @@
                 <w:sz w:val="20"/>
                 <w:szCs w:val="20"/>
               </w:rPr>
-              <w:t>🔑  Rol: Functioneel beheerder — volledige toegang</w:t>
+              <w:t>🔑</w:t>
+            </w:r>
+            <w:r>
+              <w:rPr>
+                <w:color w:val="1A3A5C"/>
+                <w:sz w:val="20"/>
+                <w:szCs w:val="20"/>
+              </w:rPr>
+              <w:t xml:space="preserve">  Rol: Functioneel beheerder — volledige toegang</w:t>
             </w:r>
           </w:p>
         </w:tc>
@@ -6128,7 +6329,15 @@
                 <w:sz w:val="20"/>
                 <w:szCs w:val="20"/>
               </w:rPr>
-              <w:t>🔗  Navigeer naar: http://localhost/beheer/organisaties</w:t>
+              <w:t>🔗</w:t>
+            </w:r>
+            <w:r>
+              <w:rPr>
+                <w:color w:val="1A3A5C"/>
+                <w:sz w:val="20"/>
+                <w:szCs w:val="20"/>
+              </w:rPr>
+              <w:t xml:space="preserve">  Navigeer naar: http://localhost/beheer/organisaties</w:t>
             </w:r>
           </w:p>
         </w:tc>
@@ -6362,7 +6571,15 @@
                 <w:sz w:val="20"/>
                 <w:szCs w:val="20"/>
               </w:rPr>
-              <w:t>🔗  Navigeer naar: http://localhost/beheer/gemma</w:t>
+              <w:t>🔗</w:t>
+            </w:r>
+            <w:r>
+              <w:rPr>
+                <w:color w:val="1A3A5C"/>
+                <w:sz w:val="20"/>
+                <w:szCs w:val="20"/>
+              </w:rPr>
+              <w:t xml:space="preserve">  Navigeer naar: http://localhost/beheer/gemma</w:t>
             </w:r>
           </w:p>
         </w:tc>
@@ -6830,7 +7047,15 @@
                 <w:sz w:val="20"/>
                 <w:szCs w:val="20"/>
               </w:rPr>
-              <w:t>🔗  Swagger UI: http://localhost/api/schema/swagger-ui/</w:t>
+              <w:t>🔗</w:t>
+            </w:r>
+            <w:r>
+              <w:rPr>
+                <w:color w:val="1A3A5C"/>
+                <w:sz w:val="20"/>
+                <w:szCs w:val="20"/>
+              </w:rPr>
+              <w:t xml:space="preserve">  Swagger UI: http://localhost/api/schema/swagger-ui/</w:t>
             </w:r>
           </w:p>
         </w:tc>

</xml_diff>